<commit_message>
Updated the Incremental AVCDL Adoption elaboration document / diagrams (Source Code Review should have been Secure Code Review)
</commit_message>
<xml_diff>
--- a/source/reference_documents/elaboration_documents/Incremental AVCDL Adoption/Incremental AVCDL Adoption.docx
+++ b/source/reference_documents/elaboration_documents/Incremental AVCDL Adoption/Incremental AVCDL Adoption.docx
@@ -1,6 +1,6 @@
 
 <file path=word/document.xml><?xml version="1.0" encoding="utf-8"?>
-<w:document xmlns:wpc="http://schemas.microsoft.com/office/word/2010/wordprocessingCanvas" xmlns:cx="http://schemas.microsoft.com/office/drawing/2014/chartex" xmlns:cx1="http://schemas.microsoft.com/office/drawing/2015/9/8/chartex" xmlns:cx2="http://schemas.microsoft.com/office/drawing/2015/10/21/chartex" xmlns:cx3="http://schemas.microsoft.com/office/drawing/2016/5/9/chartex" xmlns:cx4="http://schemas.microsoft.com/office/drawing/2016/5/10/chartex" xmlns:cx5="http://schemas.microsoft.com/office/drawing/2016/5/11/chartex" xmlns:cx6="http://schemas.microsoft.com/office/drawing/2016/5/12/chartex" xmlns:cx7="http://schemas.microsoft.com/office/drawing/2016/5/13/chartex" xmlns:cx8="http://schemas.microsoft.com/office/drawing/2016/5/14/chartex" xmlns:mc="http://schemas.openxmlformats.org/markup-compatibility/2006" xmlns:aink="http://schemas.microsoft.com/office/drawing/2016/ink" xmlns:am3d="http://schemas.microsoft.com/office/drawing/2017/model3d" xmlns:o="urn:schemas-microsoft-com:office:office" xmlns:oel="http://schemas.microsoft.com/office/2019/extlst" xmlns:r="http://schemas.openxmlformats.org/officeDocument/2006/relationships" xmlns:m="http://schemas.openxmlformats.org/officeDocument/2006/math" xmlns:v="urn:schemas-microsoft-com:vml" xmlns:wp14="http://schemas.microsoft.com/office/word/2010/wordprocessingDrawing" xmlns:wp="http://schemas.openxmlformats.org/drawingml/2006/wordprocessingDrawing" xmlns:w10="urn:schemas-microsoft-com:office:word" xmlns:w="http://schemas.openxmlformats.org/wordprocessingml/2006/main" xmlns:w14="http://schemas.microsoft.com/office/word/2010/wordml" xmlns:w15="http://schemas.microsoft.com/office/word/2012/wordml" xmlns:w16cex="http://schemas.microsoft.com/office/word/2018/wordml/cex" xmlns:w16cid="http://schemas.microsoft.com/office/word/2016/wordml/cid" xmlns:w16="http://schemas.microsoft.com/office/word/2018/wordml" xmlns:w16sdtdh="http://schemas.microsoft.com/office/word/2020/wordml/sdtdatahash" xmlns:w16se="http://schemas.microsoft.com/office/word/2015/wordml/symex" xmlns:wpg="http://schemas.microsoft.com/office/word/2010/wordprocessingGroup" xmlns:wpi="http://schemas.microsoft.com/office/word/2010/wordprocessingInk" xmlns:wne="http://schemas.microsoft.com/office/word/2006/wordml" xmlns:wps="http://schemas.microsoft.com/office/word/2010/wordprocessingShape" mc:Ignorable="w14 w15 w16se w16cid w16 w16cex w16sdtdh wp14">
+<w:document xmlns:wpc="http://schemas.microsoft.com/office/word/2010/wordprocessingCanvas" xmlns:cx="http://schemas.microsoft.com/office/drawing/2014/chartex" xmlns:cx1="http://schemas.microsoft.com/office/drawing/2015/9/8/chartex" xmlns:cx2="http://schemas.microsoft.com/office/drawing/2015/10/21/chartex" xmlns:cx3="http://schemas.microsoft.com/office/drawing/2016/5/9/chartex" xmlns:cx4="http://schemas.microsoft.com/office/drawing/2016/5/10/chartex" xmlns:cx5="http://schemas.microsoft.com/office/drawing/2016/5/11/chartex" xmlns:cx6="http://schemas.microsoft.com/office/drawing/2016/5/12/chartex" xmlns:cx7="http://schemas.microsoft.com/office/drawing/2016/5/13/chartex" xmlns:cx8="http://schemas.microsoft.com/office/drawing/2016/5/14/chartex" xmlns:mc="http://schemas.openxmlformats.org/markup-compatibility/2006" xmlns:aink="http://schemas.microsoft.com/office/drawing/2016/ink" xmlns:am3d="http://schemas.microsoft.com/office/drawing/2017/model3d" xmlns:o="urn:schemas-microsoft-com:office:office" xmlns:oel="http://schemas.microsoft.com/office/2019/extlst" xmlns:r="http://schemas.openxmlformats.org/officeDocument/2006/relationships" xmlns:m="http://schemas.openxmlformats.org/officeDocument/2006/math" xmlns:v="urn:schemas-microsoft-com:vml" xmlns:wp14="http://schemas.microsoft.com/office/word/2010/wordprocessingDrawing" xmlns:wp="http://schemas.openxmlformats.org/drawingml/2006/wordprocessingDrawing" xmlns:w10="urn:schemas-microsoft-com:office:word" xmlns:w="http://schemas.openxmlformats.org/wordprocessingml/2006/main" xmlns:w14="http://schemas.microsoft.com/office/word/2010/wordml" xmlns:w15="http://schemas.microsoft.com/office/word/2012/wordml" xmlns:w16cex="http://schemas.microsoft.com/office/word/2018/wordml/cex" xmlns:w16cid="http://schemas.microsoft.com/office/word/2016/wordml/cid" xmlns:w16="http://schemas.microsoft.com/office/word/2018/wordml" xmlns:w16du="http://schemas.microsoft.com/office/word/2023/wordml/word16du" xmlns:w16sdtdh="http://schemas.microsoft.com/office/word/2020/wordml/sdtdatahash" xmlns:w16sdtfl="http://schemas.microsoft.com/office/word/2024/wordml/sdtformatlock" xmlns:w16se="http://schemas.microsoft.com/office/word/2015/wordml/symex" xmlns:wpg="http://schemas.microsoft.com/office/word/2010/wordprocessingGroup" xmlns:wpi="http://schemas.microsoft.com/office/word/2010/wordprocessingInk" xmlns:wne="http://schemas.microsoft.com/office/word/2006/wordml" xmlns:wps="http://schemas.microsoft.com/office/word/2010/wordprocessingShape" mc:Ignorable="w14 w15 w16se w16cid w16 w16cex w16sdtdh w16sdtfl w16du wp14">
   <w:body>
     <w:p>
       <w:pPr>
@@ -38,7 +38,7 @@
         <w:t xml:space="preserve">Version </w:t>
       </w:r>
       <w:r>
-        <w:t>6</w:t>
+        <w:t>7</w:t>
       </w:r>
     </w:p>
     <w:p>
@@ -58,7 +58,7 @@
         <w:rPr>
           <w:noProof/>
         </w:rPr>
-        <w:t>4/22/24 9:37 AM</w:t>
+        <w:t>1/13/26 1:18 PM</w:t>
       </w:r>
       <w:r>
         <w:fldChar w:fldCharType="end"/>
@@ -199,7 +199,19 @@
         <w:rPr>
           <w:lang w:val="en-US"/>
         </w:rPr>
-        <w:t xml:space="preserve">was created by </w:t>
+        <w:t xml:space="preserve">was </w:t>
+      </w:r>
+      <w:r>
+        <w:rPr>
+          <w:lang w:val="en-US"/>
+        </w:rPr>
+        <w:t xml:space="preserve">originally </w:t>
+      </w:r>
+      <w:r>
+        <w:rPr>
+          <w:lang w:val="en-US"/>
+        </w:rPr>
+        <w:t xml:space="preserve">created by </w:t>
       </w:r>
       <w:r>
         <w:rPr>
@@ -357,9 +369,9 @@
           <w:noProof/>
         </w:rPr>
         <w:drawing>
-          <wp:inline distT="0" distB="0" distL="0" distR="0" wp14:anchorId="0E0154A2" wp14:editId="2B2B7DEB">
-            <wp:extent cx="5943600" cy="3057818"/>
-            <wp:effectExtent l="0" t="0" r="0" b="3175"/>
+          <wp:inline distT="0" distB="0" distL="0" distR="0" wp14:anchorId="0E0154A2" wp14:editId="01A3D7D2">
+            <wp:extent cx="5938482" cy="3057818"/>
+            <wp:effectExtent l="0" t="0" r="5715" b="3175"/>
             <wp:docPr id="11" name="Picture 11"/>
             <wp:cNvGraphicFramePr>
               <a:graphicFrameLocks xmlns:a="http://schemas.openxmlformats.org/drawingml/2006/main" noChangeAspect="1"/>
@@ -372,7 +384,7 @@
                     <pic:cNvPicPr/>
                   </pic:nvPicPr>
                   <pic:blipFill>
-                    <a:blip r:embed="rId9">
+                    <a:blip r:embed="rId9" cstate="print">
                       <a:extLst>
                         <a:ext uri="{28A0092B-C50C-407E-A947-70E740481C1C}">
                           <a14:useLocalDpi xmlns:a14="http://schemas.microsoft.com/office/drawing/2010/main" val="0"/>
@@ -386,7 +398,7 @@
                   <pic:spPr>
                     <a:xfrm>
                       <a:off x="0" y="0"/>
-                      <a:ext cx="5943600" cy="3057818"/>
+                      <a:ext cx="5938482" cy="3057818"/>
                     </a:xfrm>
                     <a:prstGeom prst="rect">
                       <a:avLst/>
@@ -613,8 +625,8 @@
           <w:noProof/>
         </w:rPr>
         <w:drawing>
-          <wp:inline distT="0" distB="0" distL="0" distR="0" wp14:anchorId="0839F0E3" wp14:editId="1E236230">
-            <wp:extent cx="6036220" cy="3418972"/>
+          <wp:inline distT="0" distB="0" distL="0" distR="0" wp14:anchorId="0839F0E3" wp14:editId="3543B5D7">
+            <wp:extent cx="6036218" cy="3418972"/>
             <wp:effectExtent l="0" t="0" r="0" b="0"/>
             <wp:docPr id="10" name="Picture 10"/>
             <wp:cNvGraphicFramePr>
@@ -628,7 +640,7 @@
                     <pic:cNvPicPr/>
                   </pic:nvPicPr>
                   <pic:blipFill>
-                    <a:blip r:embed="rId10">
+                    <a:blip r:embed="rId10" cstate="print">
                       <a:extLst>
                         <a:ext uri="{28A0092B-C50C-407E-A947-70E740481C1C}">
                           <a14:useLocalDpi xmlns:a14="http://schemas.microsoft.com/office/drawing/2010/main" val="0"/>
@@ -642,7 +654,7 @@
                   <pic:spPr>
                     <a:xfrm>
                       <a:off x="0" y="0"/>
-                      <a:ext cx="6036220" cy="3418972"/>
+                      <a:ext cx="6036218" cy="3418972"/>
                     </a:xfrm>
                     <a:prstGeom prst="rect">
                       <a:avLst/>
@@ -827,9 +839,9 @@
           <w:noProof/>
         </w:rPr>
         <w:drawing>
-          <wp:inline distT="0" distB="0" distL="0" distR="0" wp14:anchorId="31AA45EF" wp14:editId="1BAB3483">
-            <wp:extent cx="3321050" cy="266464"/>
-            <wp:effectExtent l="0" t="0" r="0" b="635"/>
+          <wp:inline distT="0" distB="0" distL="0" distR="0" wp14:anchorId="31AA45EF" wp14:editId="34EE4E6F">
+            <wp:extent cx="3331084" cy="267269"/>
+            <wp:effectExtent l="0" t="0" r="0" b="0"/>
             <wp:docPr id="16" name="Picture 16"/>
             <wp:cNvGraphicFramePr>
               <a:graphicFrameLocks xmlns:a="http://schemas.openxmlformats.org/drawingml/2006/main" noChangeAspect="1"/>
@@ -842,7 +854,7 @@
                     <pic:cNvPicPr/>
                   </pic:nvPicPr>
                   <pic:blipFill>
-                    <a:blip r:embed="rId11">
+                    <a:blip r:embed="rId11" cstate="print">
                       <a:extLst>
                         <a:ext uri="{28A0092B-C50C-407E-A947-70E740481C1C}">
                           <a14:useLocalDpi xmlns:a14="http://schemas.microsoft.com/office/drawing/2010/main" val="0"/>
@@ -856,7 +868,7 @@
                   <pic:spPr>
                     <a:xfrm>
                       <a:off x="0" y="0"/>
-                      <a:ext cx="3331086" cy="267269"/>
+                      <a:ext cx="3331084" cy="267269"/>
                     </a:xfrm>
                     <a:prstGeom prst="rect">
                       <a:avLst/>
@@ -1067,9 +1079,9 @@
           <w:noProof/>
         </w:rPr>
         <w:drawing>
-          <wp:inline distT="0" distB="0" distL="0" distR="0" wp14:anchorId="4AA789EB" wp14:editId="37C6767D">
-            <wp:extent cx="5921375" cy="972751"/>
-            <wp:effectExtent l="0" t="0" r="0" b="5715"/>
+          <wp:inline distT="0" distB="0" distL="0" distR="0" wp14:anchorId="4AA789EB" wp14:editId="34F1A25B">
+            <wp:extent cx="6026313" cy="989989"/>
+            <wp:effectExtent l="0" t="0" r="6350" b="635"/>
             <wp:docPr id="15" name="Picture 15"/>
             <wp:cNvGraphicFramePr>
               <a:graphicFrameLocks xmlns:a="http://schemas.openxmlformats.org/drawingml/2006/main" noChangeAspect="1"/>
@@ -1082,7 +1094,7 @@
                     <pic:cNvPicPr/>
                   </pic:nvPicPr>
                   <pic:blipFill>
-                    <a:blip r:embed="rId12">
+                    <a:blip r:embed="rId12" cstate="print">
                       <a:extLst>
                         <a:ext uri="{28A0092B-C50C-407E-A947-70E740481C1C}">
                           <a14:useLocalDpi xmlns:a14="http://schemas.microsoft.com/office/drawing/2010/main" val="0"/>
@@ -1096,7 +1108,7 @@
                   <pic:spPr>
                     <a:xfrm>
                       <a:off x="0" y="0"/>
-                      <a:ext cx="6026313" cy="989990"/>
+                      <a:ext cx="6026313" cy="989989"/>
                     </a:xfrm>
                     <a:prstGeom prst="rect">
                       <a:avLst/>
@@ -1308,7 +1320,10 @@
         <w:jc w:val="both"/>
       </w:pPr>
       <w:r>
-        <w:t>Source Code Review</w:t>
+        <w:t>Secure</w:t>
+      </w:r>
+      <w:r>
+        <w:t xml:space="preserve"> Code Review</w:t>
       </w:r>
       <w:r>
         <w:t xml:space="preserve"> </w:t>
@@ -1475,9 +1490,9 @@
           <w:noProof/>
         </w:rPr>
         <w:drawing>
-          <wp:inline distT="0" distB="0" distL="0" distR="0" wp14:anchorId="58C5F949" wp14:editId="53D7B5A4">
-            <wp:extent cx="6149340" cy="671208"/>
-            <wp:effectExtent l="0" t="0" r="0" b="1905"/>
+          <wp:inline distT="0" distB="0" distL="0" distR="0" wp14:anchorId="58C5F949" wp14:editId="446A1698">
+            <wp:extent cx="6180041" cy="674557"/>
+            <wp:effectExtent l="0" t="0" r="0" b="0"/>
             <wp:docPr id="17" name="Picture 17"/>
             <wp:cNvGraphicFramePr>
               <a:graphicFrameLocks xmlns:a="http://schemas.openxmlformats.org/drawingml/2006/main" noChangeAspect="1"/>
@@ -1490,7 +1505,7 @@
                     <pic:cNvPicPr/>
                   </pic:nvPicPr>
                   <pic:blipFill>
-                    <a:blip r:embed="rId13">
+                    <a:blip r:embed="rId13" cstate="print">
                       <a:extLst>
                         <a:ext uri="{28A0092B-C50C-407E-A947-70E740481C1C}">
                           <a14:useLocalDpi xmlns:a14="http://schemas.microsoft.com/office/drawing/2010/main" val="0"/>
@@ -1504,7 +1519,7 @@
                   <pic:spPr>
                     <a:xfrm>
                       <a:off x="0" y="0"/>
-                      <a:ext cx="6180041" cy="674559"/>
+                      <a:ext cx="6180041" cy="674557"/>
                     </a:xfrm>
                     <a:prstGeom prst="rect">
                       <a:avLst/>
@@ -1710,7 +1725,10 @@
         <w:jc w:val="both"/>
       </w:pPr>
       <w:r>
-        <w:t>Source Code Review</w:t>
+        <w:t>Secure</w:t>
+      </w:r>
+      <w:r>
+        <w:t xml:space="preserve"> Code Review</w:t>
       </w:r>
     </w:p>
     <w:p>
@@ -1795,8 +1813,8 @@
           <w:noProof/>
         </w:rPr>
         <w:drawing>
-          <wp:inline distT="0" distB="0" distL="0" distR="0" wp14:anchorId="70B7CD25" wp14:editId="0912A0A0">
-            <wp:extent cx="6388429" cy="775855"/>
+          <wp:inline distT="0" distB="0" distL="0" distR="0" wp14:anchorId="70B7CD25" wp14:editId="105FC08A">
+            <wp:extent cx="6400800" cy="777358"/>
             <wp:effectExtent l="0" t="0" r="0" b="0"/>
             <wp:docPr id="18" name="Picture 18"/>
             <wp:cNvGraphicFramePr>
@@ -1810,7 +1828,7 @@
                     <pic:cNvPicPr/>
                   </pic:nvPicPr>
                   <pic:blipFill>
-                    <a:blip r:embed="rId14">
+                    <a:blip r:embed="rId14" cstate="print">
                       <a:extLst>
                         <a:ext uri="{28A0092B-C50C-407E-A947-70E740481C1C}">
                           <a14:useLocalDpi xmlns:a14="http://schemas.microsoft.com/office/drawing/2010/main" val="0"/>
@@ -1824,7 +1842,7 @@
                   <pic:spPr>
                     <a:xfrm>
                       <a:off x="0" y="0"/>
-                      <a:ext cx="6655169" cy="808250"/>
+                      <a:ext cx="6484586" cy="787534"/>
                     </a:xfrm>
                     <a:prstGeom prst="rect">
                       <a:avLst/>
@@ -2104,9 +2122,9 @@
           <w:noProof/>
         </w:rPr>
         <w:drawing>
-          <wp:inline distT="0" distB="0" distL="0" distR="0" wp14:anchorId="10AF51E8" wp14:editId="4C121260">
-            <wp:extent cx="1682885" cy="274894"/>
-            <wp:effectExtent l="0" t="0" r="0" b="5080"/>
+          <wp:inline distT="0" distB="0" distL="0" distR="0" wp14:anchorId="10AF51E8" wp14:editId="19B6AEE2">
+            <wp:extent cx="1621892" cy="264930"/>
+            <wp:effectExtent l="0" t="0" r="3810" b="1905"/>
             <wp:docPr id="19" name="Picture 19"/>
             <wp:cNvGraphicFramePr>
               <a:graphicFrameLocks xmlns:a="http://schemas.openxmlformats.org/drawingml/2006/main" noChangeAspect="1"/>
@@ -2119,7 +2137,7 @@
                     <pic:cNvPicPr/>
                   </pic:nvPicPr>
                   <pic:blipFill>
-                    <a:blip r:embed="rId15">
+                    <a:blip r:embed="rId15" cstate="print">
                       <a:extLst>
                         <a:ext uri="{28A0092B-C50C-407E-A947-70E740481C1C}">
                           <a14:useLocalDpi xmlns:a14="http://schemas.microsoft.com/office/drawing/2010/main" val="0"/>
@@ -2133,7 +2151,7 @@
                   <pic:spPr>
                     <a:xfrm>
                       <a:off x="0" y="0"/>
-                      <a:ext cx="1854891" cy="302991"/>
+                      <a:ext cx="1667205" cy="272332"/>
                     </a:xfrm>
                     <a:prstGeom prst="rect">
                       <a:avLst/>
@@ -2260,7 +2278,17 @@
         <w:jc w:val="both"/>
       </w:pPr>
       <w:r>
-        <w:t>As with any complex system, the supply chain must be given consideration. There are three cybersecurity related supplier activities used in conjunction with the AVCDL.</w:t>
+        <w:t xml:space="preserve">As with any complex system, the supply chain must be given consideration. There are three cybersecurity related supplier activities used in conjunction with the </w:t>
+      </w:r>
+      <w:r>
+        <w:rPr>
+          <w:b/>
+          <w:bCs/>
+        </w:rPr>
+        <w:t>AVCDL</w:t>
+      </w:r>
+      <w:r>
+        <w:t>.</w:t>
       </w:r>
     </w:p>
     <w:p>
@@ -2277,9 +2305,9 @@
           <w:color w:val="FF0000"/>
         </w:rPr>
         <w:drawing>
-          <wp:inline distT="0" distB="0" distL="0" distR="0" wp14:anchorId="668DF6EA" wp14:editId="015885CD">
-            <wp:extent cx="2966720" cy="319254"/>
-            <wp:effectExtent l="0" t="0" r="0" b="0"/>
+          <wp:inline distT="0" distB="0" distL="0" distR="0" wp14:anchorId="668DF6EA" wp14:editId="60B1A292">
+            <wp:extent cx="2542966" cy="273652"/>
+            <wp:effectExtent l="0" t="0" r="0" b="6350"/>
             <wp:docPr id="20" name="Picture 20"/>
             <wp:cNvGraphicFramePr>
               <a:graphicFrameLocks xmlns:a="http://schemas.openxmlformats.org/drawingml/2006/main" noChangeAspect="1"/>
@@ -2292,7 +2320,7 @@
                     <pic:cNvPicPr/>
                   </pic:nvPicPr>
                   <pic:blipFill>
-                    <a:blip r:embed="rId16">
+                    <a:blip r:embed="rId16" cstate="print">
                       <a:extLst>
                         <a:ext uri="{28A0092B-C50C-407E-A947-70E740481C1C}">
                           <a14:useLocalDpi xmlns:a14="http://schemas.microsoft.com/office/drawing/2010/main" val="0"/>
@@ -2306,7 +2334,7 @@
                   <pic:spPr>
                     <a:xfrm>
                       <a:off x="0" y="0"/>
-                      <a:ext cx="3166955" cy="340802"/>
+                      <a:ext cx="2697220" cy="290252"/>
                     </a:xfrm>
                     <a:prstGeom prst="rect">
                       <a:avLst/>
@@ -2467,7 +2495,7 @@
 </file>
 
 <file path=word/endnotes.xml><?xml version="1.0" encoding="utf-8"?>
-<w:endnotes xmlns:wpc="http://schemas.microsoft.com/office/word/2010/wordprocessingCanvas" xmlns:cx="http://schemas.microsoft.com/office/drawing/2014/chartex" xmlns:cx1="http://schemas.microsoft.com/office/drawing/2015/9/8/chartex" xmlns:cx2="http://schemas.microsoft.com/office/drawing/2015/10/21/chartex" xmlns:cx3="http://schemas.microsoft.com/office/drawing/2016/5/9/chartex" xmlns:cx4="http://schemas.microsoft.com/office/drawing/2016/5/10/chartex" xmlns:cx5="http://schemas.microsoft.com/office/drawing/2016/5/11/chartex" xmlns:cx6="http://schemas.microsoft.com/office/drawing/2016/5/12/chartex" xmlns:cx7="http://schemas.microsoft.com/office/drawing/2016/5/13/chartex" xmlns:cx8="http://schemas.microsoft.com/office/drawing/2016/5/14/chartex" xmlns:mc="http://schemas.openxmlformats.org/markup-compatibility/2006" xmlns:aink="http://schemas.microsoft.com/office/drawing/2016/ink" xmlns:am3d="http://schemas.microsoft.com/office/drawing/2017/model3d" xmlns:o="urn:schemas-microsoft-com:office:office" xmlns:oel="http://schemas.microsoft.com/office/2019/extlst" xmlns:r="http://schemas.openxmlformats.org/officeDocument/2006/relationships" xmlns:m="http://schemas.openxmlformats.org/officeDocument/2006/math" xmlns:v="urn:schemas-microsoft-com:vml" xmlns:wp14="http://schemas.microsoft.com/office/word/2010/wordprocessingDrawing" xmlns:wp="http://schemas.openxmlformats.org/drawingml/2006/wordprocessingDrawing" xmlns:w10="urn:schemas-microsoft-com:office:word" xmlns:w="http://schemas.openxmlformats.org/wordprocessingml/2006/main" xmlns:w14="http://schemas.microsoft.com/office/word/2010/wordml" xmlns:w15="http://schemas.microsoft.com/office/word/2012/wordml" xmlns:w16cex="http://schemas.microsoft.com/office/word/2018/wordml/cex" xmlns:w16cid="http://schemas.microsoft.com/office/word/2016/wordml/cid" xmlns:w16="http://schemas.microsoft.com/office/word/2018/wordml" xmlns:w16sdtdh="http://schemas.microsoft.com/office/word/2020/wordml/sdtdatahash" xmlns:w16se="http://schemas.microsoft.com/office/word/2015/wordml/symex" xmlns:wpg="http://schemas.microsoft.com/office/word/2010/wordprocessingGroup" xmlns:wpi="http://schemas.microsoft.com/office/word/2010/wordprocessingInk" xmlns:wne="http://schemas.microsoft.com/office/word/2006/wordml" xmlns:wps="http://schemas.microsoft.com/office/word/2010/wordprocessingShape" mc:Ignorable="w14 w15 w16se w16cid w16 w16cex w16sdtdh wp14">
+<w:endnotes xmlns:wpc="http://schemas.microsoft.com/office/word/2010/wordprocessingCanvas" xmlns:cx="http://schemas.microsoft.com/office/drawing/2014/chartex" xmlns:cx1="http://schemas.microsoft.com/office/drawing/2015/9/8/chartex" xmlns:cx2="http://schemas.microsoft.com/office/drawing/2015/10/21/chartex" xmlns:cx3="http://schemas.microsoft.com/office/drawing/2016/5/9/chartex" xmlns:cx4="http://schemas.microsoft.com/office/drawing/2016/5/10/chartex" xmlns:cx5="http://schemas.microsoft.com/office/drawing/2016/5/11/chartex" xmlns:cx6="http://schemas.microsoft.com/office/drawing/2016/5/12/chartex" xmlns:cx7="http://schemas.microsoft.com/office/drawing/2016/5/13/chartex" xmlns:cx8="http://schemas.microsoft.com/office/drawing/2016/5/14/chartex" xmlns:mc="http://schemas.openxmlformats.org/markup-compatibility/2006" xmlns:aink="http://schemas.microsoft.com/office/drawing/2016/ink" xmlns:am3d="http://schemas.microsoft.com/office/drawing/2017/model3d" xmlns:o="urn:schemas-microsoft-com:office:office" xmlns:oel="http://schemas.microsoft.com/office/2019/extlst" xmlns:r="http://schemas.openxmlformats.org/officeDocument/2006/relationships" xmlns:m="http://schemas.openxmlformats.org/officeDocument/2006/math" xmlns:v="urn:schemas-microsoft-com:vml" xmlns:wp14="http://schemas.microsoft.com/office/word/2010/wordprocessingDrawing" xmlns:wp="http://schemas.openxmlformats.org/drawingml/2006/wordprocessingDrawing" xmlns:w10="urn:schemas-microsoft-com:office:word" xmlns:w="http://schemas.openxmlformats.org/wordprocessingml/2006/main" xmlns:w14="http://schemas.microsoft.com/office/word/2010/wordml" xmlns:w15="http://schemas.microsoft.com/office/word/2012/wordml" xmlns:w16cex="http://schemas.microsoft.com/office/word/2018/wordml/cex" xmlns:w16cid="http://schemas.microsoft.com/office/word/2016/wordml/cid" xmlns:w16="http://schemas.microsoft.com/office/word/2018/wordml" xmlns:w16du="http://schemas.microsoft.com/office/word/2023/wordml/word16du" xmlns:w16sdtdh="http://schemas.microsoft.com/office/word/2020/wordml/sdtdatahash" xmlns:w16sdtfl="http://schemas.microsoft.com/office/word/2024/wordml/sdtformatlock" xmlns:w16se="http://schemas.microsoft.com/office/word/2015/wordml/symex" xmlns:wpg="http://schemas.microsoft.com/office/word/2010/wordprocessingGroup" xmlns:wpi="http://schemas.microsoft.com/office/word/2010/wordprocessingInk" xmlns:wne="http://schemas.microsoft.com/office/word/2006/wordml" xmlns:wps="http://schemas.microsoft.com/office/word/2010/wordprocessingShape" mc:Ignorable="w14 w15 w16se w16cid w16 w16cex w16sdtdh w16sdtfl w16du wp14">
   <w:endnote w:type="separator" w:id="-1">
     <w:p>
       <w:pPr>
@@ -2492,7 +2520,7 @@
 </file>
 
 <file path=word/footer1.xml><?xml version="1.0" encoding="utf-8"?>
-<w:ftr xmlns:wpc="http://schemas.microsoft.com/office/word/2010/wordprocessingCanvas" xmlns:cx="http://schemas.microsoft.com/office/drawing/2014/chartex" xmlns:cx1="http://schemas.microsoft.com/office/drawing/2015/9/8/chartex" xmlns:cx2="http://schemas.microsoft.com/office/drawing/2015/10/21/chartex" xmlns:cx3="http://schemas.microsoft.com/office/drawing/2016/5/9/chartex" xmlns:cx4="http://schemas.microsoft.com/office/drawing/2016/5/10/chartex" xmlns:cx5="http://schemas.microsoft.com/office/drawing/2016/5/11/chartex" xmlns:cx6="http://schemas.microsoft.com/office/drawing/2016/5/12/chartex" xmlns:cx7="http://schemas.microsoft.com/office/drawing/2016/5/13/chartex" xmlns:cx8="http://schemas.microsoft.com/office/drawing/2016/5/14/chartex" xmlns:mc="http://schemas.openxmlformats.org/markup-compatibility/2006" xmlns:aink="http://schemas.microsoft.com/office/drawing/2016/ink" xmlns:am3d="http://schemas.microsoft.com/office/drawing/2017/model3d" xmlns:o="urn:schemas-microsoft-com:office:office" xmlns:oel="http://schemas.microsoft.com/office/2019/extlst" xmlns:r="http://schemas.openxmlformats.org/officeDocument/2006/relationships" xmlns:m="http://schemas.openxmlformats.org/officeDocument/2006/math" xmlns:v="urn:schemas-microsoft-com:vml" xmlns:wp14="http://schemas.microsoft.com/office/word/2010/wordprocessingDrawing" xmlns:wp="http://schemas.openxmlformats.org/drawingml/2006/wordprocessingDrawing" xmlns:w10="urn:schemas-microsoft-com:office:word" xmlns:w="http://schemas.openxmlformats.org/wordprocessingml/2006/main" xmlns:w14="http://schemas.microsoft.com/office/word/2010/wordml" xmlns:w15="http://schemas.microsoft.com/office/word/2012/wordml" xmlns:w16cex="http://schemas.microsoft.com/office/word/2018/wordml/cex" xmlns:w16cid="http://schemas.microsoft.com/office/word/2016/wordml/cid" xmlns:w16="http://schemas.microsoft.com/office/word/2018/wordml" xmlns:w16sdtdh="http://schemas.microsoft.com/office/word/2020/wordml/sdtdatahash" xmlns:w16se="http://schemas.microsoft.com/office/word/2015/wordml/symex" xmlns:wpg="http://schemas.microsoft.com/office/word/2010/wordprocessingGroup" xmlns:wpi="http://schemas.microsoft.com/office/word/2010/wordprocessingInk" xmlns:wne="http://schemas.microsoft.com/office/word/2006/wordml" xmlns:wps="http://schemas.microsoft.com/office/word/2010/wordprocessingShape" mc:Ignorable="w14 w15 w16se w16cid w16 w16cex w16sdtdh wp14">
+<w:ftr xmlns:wpc="http://schemas.microsoft.com/office/word/2010/wordprocessingCanvas" xmlns:cx="http://schemas.microsoft.com/office/drawing/2014/chartex" xmlns:cx1="http://schemas.microsoft.com/office/drawing/2015/9/8/chartex" xmlns:cx2="http://schemas.microsoft.com/office/drawing/2015/10/21/chartex" xmlns:cx3="http://schemas.microsoft.com/office/drawing/2016/5/9/chartex" xmlns:cx4="http://schemas.microsoft.com/office/drawing/2016/5/10/chartex" xmlns:cx5="http://schemas.microsoft.com/office/drawing/2016/5/11/chartex" xmlns:cx6="http://schemas.microsoft.com/office/drawing/2016/5/12/chartex" xmlns:cx7="http://schemas.microsoft.com/office/drawing/2016/5/13/chartex" xmlns:cx8="http://schemas.microsoft.com/office/drawing/2016/5/14/chartex" xmlns:mc="http://schemas.openxmlformats.org/markup-compatibility/2006" xmlns:aink="http://schemas.microsoft.com/office/drawing/2016/ink" xmlns:am3d="http://schemas.microsoft.com/office/drawing/2017/model3d" xmlns:o="urn:schemas-microsoft-com:office:office" xmlns:oel="http://schemas.microsoft.com/office/2019/extlst" xmlns:r="http://schemas.openxmlformats.org/officeDocument/2006/relationships" xmlns:m="http://schemas.openxmlformats.org/officeDocument/2006/math" xmlns:v="urn:schemas-microsoft-com:vml" xmlns:wp14="http://schemas.microsoft.com/office/word/2010/wordprocessingDrawing" xmlns:wp="http://schemas.openxmlformats.org/drawingml/2006/wordprocessingDrawing" xmlns:w10="urn:schemas-microsoft-com:office:word" xmlns:w="http://schemas.openxmlformats.org/wordprocessingml/2006/main" xmlns:w14="http://schemas.microsoft.com/office/word/2010/wordml" xmlns:w15="http://schemas.microsoft.com/office/word/2012/wordml" xmlns:w16cex="http://schemas.microsoft.com/office/word/2018/wordml/cex" xmlns:w16cid="http://schemas.microsoft.com/office/word/2016/wordml/cid" xmlns:w16="http://schemas.microsoft.com/office/word/2018/wordml" xmlns:w16du="http://schemas.microsoft.com/office/word/2023/wordml/word16du" xmlns:w16sdtdh="http://schemas.microsoft.com/office/word/2020/wordml/sdtdatahash" xmlns:w16sdtfl="http://schemas.microsoft.com/office/word/2024/wordml/sdtformatlock" xmlns:w16se="http://schemas.microsoft.com/office/word/2015/wordml/symex" xmlns:wpg="http://schemas.microsoft.com/office/word/2010/wordprocessingGroup" xmlns:wpi="http://schemas.microsoft.com/office/word/2010/wordprocessingInk" xmlns:wne="http://schemas.microsoft.com/office/word/2006/wordml" xmlns:wps="http://schemas.microsoft.com/office/word/2010/wordprocessingShape" mc:Ignorable="w14 w15 w16se w16cid w16 w16cex w16sdtdh w16sdtfl w16du wp14">
   <w:sdt>
     <w:sdtPr>
       <w:rPr>
@@ -2544,7 +2572,7 @@
 </file>
 
 <file path=word/footer2.xml><?xml version="1.0" encoding="utf-8"?>
-<w:ftr xmlns:wpc="http://schemas.microsoft.com/office/word/2010/wordprocessingCanvas" xmlns:cx="http://schemas.microsoft.com/office/drawing/2014/chartex" xmlns:cx1="http://schemas.microsoft.com/office/drawing/2015/9/8/chartex" xmlns:cx2="http://schemas.microsoft.com/office/drawing/2015/10/21/chartex" xmlns:cx3="http://schemas.microsoft.com/office/drawing/2016/5/9/chartex" xmlns:cx4="http://schemas.microsoft.com/office/drawing/2016/5/10/chartex" xmlns:cx5="http://schemas.microsoft.com/office/drawing/2016/5/11/chartex" xmlns:cx6="http://schemas.microsoft.com/office/drawing/2016/5/12/chartex" xmlns:cx7="http://schemas.microsoft.com/office/drawing/2016/5/13/chartex" xmlns:cx8="http://schemas.microsoft.com/office/drawing/2016/5/14/chartex" xmlns:mc="http://schemas.openxmlformats.org/markup-compatibility/2006" xmlns:aink="http://schemas.microsoft.com/office/drawing/2016/ink" xmlns:am3d="http://schemas.microsoft.com/office/drawing/2017/model3d" xmlns:o="urn:schemas-microsoft-com:office:office" xmlns:oel="http://schemas.microsoft.com/office/2019/extlst" xmlns:r="http://schemas.openxmlformats.org/officeDocument/2006/relationships" xmlns:m="http://schemas.openxmlformats.org/officeDocument/2006/math" xmlns:v="urn:schemas-microsoft-com:vml" xmlns:wp14="http://schemas.microsoft.com/office/word/2010/wordprocessingDrawing" xmlns:wp="http://schemas.openxmlformats.org/drawingml/2006/wordprocessingDrawing" xmlns:w10="urn:schemas-microsoft-com:office:word" xmlns:w="http://schemas.openxmlformats.org/wordprocessingml/2006/main" xmlns:w14="http://schemas.microsoft.com/office/word/2010/wordml" xmlns:w15="http://schemas.microsoft.com/office/word/2012/wordml" xmlns:w16cex="http://schemas.microsoft.com/office/word/2018/wordml/cex" xmlns:w16cid="http://schemas.microsoft.com/office/word/2016/wordml/cid" xmlns:w16="http://schemas.microsoft.com/office/word/2018/wordml" xmlns:w16sdtdh="http://schemas.microsoft.com/office/word/2020/wordml/sdtdatahash" xmlns:w16se="http://schemas.microsoft.com/office/word/2015/wordml/symex" xmlns:wpg="http://schemas.microsoft.com/office/word/2010/wordprocessingGroup" xmlns:wpi="http://schemas.microsoft.com/office/word/2010/wordprocessingInk" xmlns:wne="http://schemas.microsoft.com/office/word/2006/wordml" xmlns:wps="http://schemas.microsoft.com/office/word/2010/wordprocessingShape" mc:Ignorable="w14 w15 w16se w16cid w16 w16cex w16sdtdh wp14">
+<w:ftr xmlns:wpc="http://schemas.microsoft.com/office/word/2010/wordprocessingCanvas" xmlns:cx="http://schemas.microsoft.com/office/drawing/2014/chartex" xmlns:cx1="http://schemas.microsoft.com/office/drawing/2015/9/8/chartex" xmlns:cx2="http://schemas.microsoft.com/office/drawing/2015/10/21/chartex" xmlns:cx3="http://schemas.microsoft.com/office/drawing/2016/5/9/chartex" xmlns:cx4="http://schemas.microsoft.com/office/drawing/2016/5/10/chartex" xmlns:cx5="http://schemas.microsoft.com/office/drawing/2016/5/11/chartex" xmlns:cx6="http://schemas.microsoft.com/office/drawing/2016/5/12/chartex" xmlns:cx7="http://schemas.microsoft.com/office/drawing/2016/5/13/chartex" xmlns:cx8="http://schemas.microsoft.com/office/drawing/2016/5/14/chartex" xmlns:mc="http://schemas.openxmlformats.org/markup-compatibility/2006" xmlns:aink="http://schemas.microsoft.com/office/drawing/2016/ink" xmlns:am3d="http://schemas.microsoft.com/office/drawing/2017/model3d" xmlns:o="urn:schemas-microsoft-com:office:office" xmlns:oel="http://schemas.microsoft.com/office/2019/extlst" xmlns:r="http://schemas.openxmlformats.org/officeDocument/2006/relationships" xmlns:m="http://schemas.openxmlformats.org/officeDocument/2006/math" xmlns:v="urn:schemas-microsoft-com:vml" xmlns:wp14="http://schemas.microsoft.com/office/word/2010/wordprocessingDrawing" xmlns:wp="http://schemas.openxmlformats.org/drawingml/2006/wordprocessingDrawing" xmlns:w10="urn:schemas-microsoft-com:office:word" xmlns:w="http://schemas.openxmlformats.org/wordprocessingml/2006/main" xmlns:w14="http://schemas.microsoft.com/office/word/2010/wordml" xmlns:w15="http://schemas.microsoft.com/office/word/2012/wordml" xmlns:w16cex="http://schemas.microsoft.com/office/word/2018/wordml/cex" xmlns:w16cid="http://schemas.microsoft.com/office/word/2016/wordml/cid" xmlns:w16="http://schemas.microsoft.com/office/word/2018/wordml" xmlns:w16du="http://schemas.microsoft.com/office/word/2023/wordml/word16du" xmlns:w16sdtdh="http://schemas.microsoft.com/office/word/2020/wordml/sdtdatahash" xmlns:w16sdtfl="http://schemas.microsoft.com/office/word/2024/wordml/sdtformatlock" xmlns:w16se="http://schemas.microsoft.com/office/word/2015/wordml/symex" xmlns:wpg="http://schemas.microsoft.com/office/word/2010/wordprocessingGroup" xmlns:wpi="http://schemas.microsoft.com/office/word/2010/wordprocessingInk" xmlns:wne="http://schemas.microsoft.com/office/word/2006/wordml" xmlns:wps="http://schemas.microsoft.com/office/word/2010/wordprocessingShape" mc:Ignorable="w14 w15 w16se w16cid w16 w16cex w16sdtdh w16sdtfl w16du wp14">
   <w:sdt>
     <w:sdtPr>
       <w:rPr>
@@ -2609,7 +2637,7 @@
 </file>
 
 <file path=word/footnotes.xml><?xml version="1.0" encoding="utf-8"?>
-<w:footnotes xmlns:wpc="http://schemas.microsoft.com/office/word/2010/wordprocessingCanvas" xmlns:cx="http://schemas.microsoft.com/office/drawing/2014/chartex" xmlns:cx1="http://schemas.microsoft.com/office/drawing/2015/9/8/chartex" xmlns:cx2="http://schemas.microsoft.com/office/drawing/2015/10/21/chartex" xmlns:cx3="http://schemas.microsoft.com/office/drawing/2016/5/9/chartex" xmlns:cx4="http://schemas.microsoft.com/office/drawing/2016/5/10/chartex" xmlns:cx5="http://schemas.microsoft.com/office/drawing/2016/5/11/chartex" xmlns:cx6="http://schemas.microsoft.com/office/drawing/2016/5/12/chartex" xmlns:cx7="http://schemas.microsoft.com/office/drawing/2016/5/13/chartex" xmlns:cx8="http://schemas.microsoft.com/office/drawing/2016/5/14/chartex" xmlns:mc="http://schemas.openxmlformats.org/markup-compatibility/2006" xmlns:aink="http://schemas.microsoft.com/office/drawing/2016/ink" xmlns:am3d="http://schemas.microsoft.com/office/drawing/2017/model3d" xmlns:o="urn:schemas-microsoft-com:office:office" xmlns:oel="http://schemas.microsoft.com/office/2019/extlst" xmlns:r="http://schemas.openxmlformats.org/officeDocument/2006/relationships" xmlns:m="http://schemas.openxmlformats.org/officeDocument/2006/math" xmlns:v="urn:schemas-microsoft-com:vml" xmlns:wp14="http://schemas.microsoft.com/office/word/2010/wordprocessingDrawing" xmlns:wp="http://schemas.openxmlformats.org/drawingml/2006/wordprocessingDrawing" xmlns:w10="urn:schemas-microsoft-com:office:word" xmlns:w="http://schemas.openxmlformats.org/wordprocessingml/2006/main" xmlns:w14="http://schemas.microsoft.com/office/word/2010/wordml" xmlns:w15="http://schemas.microsoft.com/office/word/2012/wordml" xmlns:w16cex="http://schemas.microsoft.com/office/word/2018/wordml/cex" xmlns:w16cid="http://schemas.microsoft.com/office/word/2016/wordml/cid" xmlns:w16="http://schemas.microsoft.com/office/word/2018/wordml" xmlns:w16sdtdh="http://schemas.microsoft.com/office/word/2020/wordml/sdtdatahash" xmlns:w16se="http://schemas.microsoft.com/office/word/2015/wordml/symex" xmlns:wpg="http://schemas.microsoft.com/office/word/2010/wordprocessingGroup" xmlns:wpi="http://schemas.microsoft.com/office/word/2010/wordprocessingInk" xmlns:wne="http://schemas.microsoft.com/office/word/2006/wordml" xmlns:wps="http://schemas.microsoft.com/office/word/2010/wordprocessingShape" mc:Ignorable="w14 w15 w16se w16cid w16 w16cex w16sdtdh wp14">
+<w:footnotes xmlns:wpc="http://schemas.microsoft.com/office/word/2010/wordprocessingCanvas" xmlns:cx="http://schemas.microsoft.com/office/drawing/2014/chartex" xmlns:cx1="http://schemas.microsoft.com/office/drawing/2015/9/8/chartex" xmlns:cx2="http://schemas.microsoft.com/office/drawing/2015/10/21/chartex" xmlns:cx3="http://schemas.microsoft.com/office/drawing/2016/5/9/chartex" xmlns:cx4="http://schemas.microsoft.com/office/drawing/2016/5/10/chartex" xmlns:cx5="http://schemas.microsoft.com/office/drawing/2016/5/11/chartex" xmlns:cx6="http://schemas.microsoft.com/office/drawing/2016/5/12/chartex" xmlns:cx7="http://schemas.microsoft.com/office/drawing/2016/5/13/chartex" xmlns:cx8="http://schemas.microsoft.com/office/drawing/2016/5/14/chartex" xmlns:mc="http://schemas.openxmlformats.org/markup-compatibility/2006" xmlns:aink="http://schemas.microsoft.com/office/drawing/2016/ink" xmlns:am3d="http://schemas.microsoft.com/office/drawing/2017/model3d" xmlns:o="urn:schemas-microsoft-com:office:office" xmlns:oel="http://schemas.microsoft.com/office/2019/extlst" xmlns:r="http://schemas.openxmlformats.org/officeDocument/2006/relationships" xmlns:m="http://schemas.openxmlformats.org/officeDocument/2006/math" xmlns:v="urn:schemas-microsoft-com:vml" xmlns:wp14="http://schemas.microsoft.com/office/word/2010/wordprocessingDrawing" xmlns:wp="http://schemas.openxmlformats.org/drawingml/2006/wordprocessingDrawing" xmlns:w10="urn:schemas-microsoft-com:office:word" xmlns:w="http://schemas.openxmlformats.org/wordprocessingml/2006/main" xmlns:w14="http://schemas.microsoft.com/office/word/2010/wordml" xmlns:w15="http://schemas.microsoft.com/office/word/2012/wordml" xmlns:w16cex="http://schemas.microsoft.com/office/word/2018/wordml/cex" xmlns:w16cid="http://schemas.microsoft.com/office/word/2016/wordml/cid" xmlns:w16="http://schemas.microsoft.com/office/word/2018/wordml" xmlns:w16du="http://schemas.microsoft.com/office/word/2023/wordml/word16du" xmlns:w16sdtdh="http://schemas.microsoft.com/office/word/2020/wordml/sdtdatahash" xmlns:w16sdtfl="http://schemas.microsoft.com/office/word/2024/wordml/sdtformatlock" xmlns:w16se="http://schemas.microsoft.com/office/word/2015/wordml/symex" xmlns:wpg="http://schemas.microsoft.com/office/word/2010/wordprocessingGroup" xmlns:wpi="http://schemas.microsoft.com/office/word/2010/wordprocessingInk" xmlns:wne="http://schemas.microsoft.com/office/word/2006/wordml" xmlns:wps="http://schemas.microsoft.com/office/word/2010/wordprocessingShape" mc:Ignorable="w14 w15 w16se w16cid w16 w16cex w16sdtdh w16sdtfl w16du wp14">
   <w:footnote w:type="separator" w:id="-1">
     <w:p>
       <w:pPr>
@@ -2634,7 +2662,7 @@
 </file>
 
 <file path=word/numbering.xml><?xml version="1.0" encoding="utf-8"?>
-<w:numbering xmlns:wpc="http://schemas.microsoft.com/office/word/2010/wordprocessingCanvas" xmlns:cx="http://schemas.microsoft.com/office/drawing/2014/chartex" xmlns:cx1="http://schemas.microsoft.com/office/drawing/2015/9/8/chartex" xmlns:cx2="http://schemas.microsoft.com/office/drawing/2015/10/21/chartex" xmlns:cx3="http://schemas.microsoft.com/office/drawing/2016/5/9/chartex" xmlns:cx4="http://schemas.microsoft.com/office/drawing/2016/5/10/chartex" xmlns:cx5="http://schemas.microsoft.com/office/drawing/2016/5/11/chartex" xmlns:cx6="http://schemas.microsoft.com/office/drawing/2016/5/12/chartex" xmlns:cx7="http://schemas.microsoft.com/office/drawing/2016/5/13/chartex" xmlns:cx8="http://schemas.microsoft.com/office/drawing/2016/5/14/chartex" xmlns:mc="http://schemas.openxmlformats.org/markup-compatibility/2006" xmlns:aink="http://schemas.microsoft.com/office/drawing/2016/ink" xmlns:am3d="http://schemas.microsoft.com/office/drawing/2017/model3d" xmlns:o="urn:schemas-microsoft-com:office:office" xmlns:oel="http://schemas.microsoft.com/office/2019/extlst" xmlns:r="http://schemas.openxmlformats.org/officeDocument/2006/relationships" xmlns:m="http://schemas.openxmlformats.org/officeDocument/2006/math" xmlns:v="urn:schemas-microsoft-com:vml" xmlns:wp14="http://schemas.microsoft.com/office/word/2010/wordprocessingDrawing" xmlns:wp="http://schemas.openxmlformats.org/drawingml/2006/wordprocessingDrawing" xmlns:w10="urn:schemas-microsoft-com:office:word" xmlns:w="http://schemas.openxmlformats.org/wordprocessingml/2006/main" xmlns:w14="http://schemas.microsoft.com/office/word/2010/wordml" xmlns:w15="http://schemas.microsoft.com/office/word/2012/wordml" xmlns:w16cex="http://schemas.microsoft.com/office/word/2018/wordml/cex" xmlns:w16cid="http://schemas.microsoft.com/office/word/2016/wordml/cid" xmlns:w16="http://schemas.microsoft.com/office/word/2018/wordml" xmlns:w16sdtdh="http://schemas.microsoft.com/office/word/2020/wordml/sdtdatahash" xmlns:w16se="http://schemas.microsoft.com/office/word/2015/wordml/symex" xmlns:wpg="http://schemas.microsoft.com/office/word/2010/wordprocessingGroup" xmlns:wpi="http://schemas.microsoft.com/office/word/2010/wordprocessingInk" xmlns:wne="http://schemas.microsoft.com/office/word/2006/wordml" xmlns:wps="http://schemas.microsoft.com/office/word/2010/wordprocessingShape" mc:Ignorable="w14 w15 w16se w16cid w16 w16cex w16sdtdh wp14">
+<w:numbering xmlns:wpc="http://schemas.microsoft.com/office/word/2010/wordprocessingCanvas" xmlns:cx="http://schemas.microsoft.com/office/drawing/2014/chartex" xmlns:cx1="http://schemas.microsoft.com/office/drawing/2015/9/8/chartex" xmlns:cx2="http://schemas.microsoft.com/office/drawing/2015/10/21/chartex" xmlns:cx3="http://schemas.microsoft.com/office/drawing/2016/5/9/chartex" xmlns:cx4="http://schemas.microsoft.com/office/drawing/2016/5/10/chartex" xmlns:cx5="http://schemas.microsoft.com/office/drawing/2016/5/11/chartex" xmlns:cx6="http://schemas.microsoft.com/office/drawing/2016/5/12/chartex" xmlns:cx7="http://schemas.microsoft.com/office/drawing/2016/5/13/chartex" xmlns:cx8="http://schemas.microsoft.com/office/drawing/2016/5/14/chartex" xmlns:mc="http://schemas.openxmlformats.org/markup-compatibility/2006" xmlns:aink="http://schemas.microsoft.com/office/drawing/2016/ink" xmlns:am3d="http://schemas.microsoft.com/office/drawing/2017/model3d" xmlns:o="urn:schemas-microsoft-com:office:office" xmlns:oel="http://schemas.microsoft.com/office/2019/extlst" xmlns:r="http://schemas.openxmlformats.org/officeDocument/2006/relationships" xmlns:m="http://schemas.openxmlformats.org/officeDocument/2006/math" xmlns:v="urn:schemas-microsoft-com:vml" xmlns:wp14="http://schemas.microsoft.com/office/word/2010/wordprocessingDrawing" xmlns:wp="http://schemas.openxmlformats.org/drawingml/2006/wordprocessingDrawing" xmlns:w10="urn:schemas-microsoft-com:office:word" xmlns:w="http://schemas.openxmlformats.org/wordprocessingml/2006/main" xmlns:w14="http://schemas.microsoft.com/office/word/2010/wordml" xmlns:w15="http://schemas.microsoft.com/office/word/2012/wordml" xmlns:w16cex="http://schemas.microsoft.com/office/word/2018/wordml/cex" xmlns:w16cid="http://schemas.microsoft.com/office/word/2016/wordml/cid" xmlns:w16="http://schemas.microsoft.com/office/word/2018/wordml" xmlns:w16du="http://schemas.microsoft.com/office/word/2023/wordml/word16du" xmlns:w16sdtdh="http://schemas.microsoft.com/office/word/2020/wordml/sdtdatahash" xmlns:w16sdtfl="http://schemas.microsoft.com/office/word/2024/wordml/sdtformatlock" xmlns:w16se="http://schemas.microsoft.com/office/word/2015/wordml/symex" xmlns:wpg="http://schemas.microsoft.com/office/word/2010/wordprocessingGroup" xmlns:wpi="http://schemas.microsoft.com/office/word/2010/wordprocessingInk" xmlns:wne="http://schemas.microsoft.com/office/word/2006/wordml" xmlns:wps="http://schemas.microsoft.com/office/word/2010/wordprocessingShape" mc:Ignorable="w14 w15 w16se w16cid w16 w16cex w16sdtdh w16sdtfl w16du wp14">
   <w:abstractNum w:abstractNumId="0" w15:restartNumberingAfterBreak="0">
     <w:nsid w:val="056815EA"/>
     <w:multiLevelType w:val="multilevel"/>
@@ -4004,7 +4032,7 @@
 </file>
 
 <file path=word/styles.xml><?xml version="1.0" encoding="utf-8"?>
-<w:styles xmlns:mc="http://schemas.openxmlformats.org/markup-compatibility/2006" xmlns:r="http://schemas.openxmlformats.org/officeDocument/2006/relationships" xmlns:w="http://schemas.openxmlformats.org/wordprocessingml/2006/main" xmlns:w14="http://schemas.microsoft.com/office/word/2010/wordml" xmlns:w15="http://schemas.microsoft.com/office/word/2012/wordml" xmlns:w16cex="http://schemas.microsoft.com/office/word/2018/wordml/cex" xmlns:w16cid="http://schemas.microsoft.com/office/word/2016/wordml/cid" xmlns:w16="http://schemas.microsoft.com/office/word/2018/wordml" xmlns:w16sdtdh="http://schemas.microsoft.com/office/word/2020/wordml/sdtdatahash" xmlns:w16se="http://schemas.microsoft.com/office/word/2015/wordml/symex" mc:Ignorable="w14 w15 w16se w16cid w16 w16cex w16sdtdh">
+<w:styles xmlns:mc="http://schemas.openxmlformats.org/markup-compatibility/2006" xmlns:r="http://schemas.openxmlformats.org/officeDocument/2006/relationships" xmlns:w="http://schemas.openxmlformats.org/wordprocessingml/2006/main" xmlns:w14="http://schemas.microsoft.com/office/word/2010/wordml" xmlns:w15="http://schemas.microsoft.com/office/word/2012/wordml" xmlns:w16cex="http://schemas.microsoft.com/office/word/2018/wordml/cex" xmlns:w16cid="http://schemas.microsoft.com/office/word/2016/wordml/cid" xmlns:w16="http://schemas.microsoft.com/office/word/2018/wordml" xmlns:w16du="http://schemas.microsoft.com/office/word/2023/wordml/word16du" xmlns:w16sdtdh="http://schemas.microsoft.com/office/word/2020/wordml/sdtdatahash" xmlns:w16sdtfl="http://schemas.microsoft.com/office/word/2024/wordml/sdtformatlock" xmlns:w16se="http://schemas.microsoft.com/office/word/2015/wordml/symex" mc:Ignorable="w14 w15 w16se w16cid w16 w16cex w16sdtdh w16sdtfl w16du">
   <w:docDefaults>
     <w:rPrDefault>
       <w:rPr>

</xml_diff>